<commit_message>
docs: 2ª rodada de correções de auditoria (601->586/+~6%, CR AP 001+002 na aba, CR-CNJ-002, RF12 fase F2, RF09 cross-repo, BL-EPROC v230, GCO 4 tags, inversões de data)
Co-Authored-By: Claude Opus 4.8 (1M context) <noreply@anthropic.com>
</commit_message>
<xml_diff>
--- a/mps-nivel-c/oficial/04_registros/AASP_Andamento-Processuais/GCO-AASPAP01-001_Registro-de-Configuracao.docx
+++ b/mps-nivel-c/oficial/04_registros/AASP_Andamento-Processuais/GCO-AASPAP01-001_Registro-de-Configuracao.docx
@@ -2985,46 +2985,8 @@
             </w:tcMar>
           </w:tcPr>
           <w:p>
-            <w:pPr>
-              <w:spacing w:before="40" w:after="40"/>
-            </w:pPr>
             <w:r>
-              <w:rPr>
-                <w:rFonts w:ascii="Courier New" w:hAnsi="Courier New"/>
-                <w:b w:val="0"/>
-                <w:i w:val="0"/>
-                <w:color w:val="333333"/>
-                <w:sz w:val="20"/>
-              </w:rPr>
-              <w:t>v230</w:t>
-            </w:r>
-            <w:r>
-              <w:rPr>
-                <w:rFonts w:ascii="Calibri" w:hAnsi="Calibri"/>
-                <w:b w:val="0"/>
-                <w:i w:val="0"/>
-                <w:sz w:val="20"/>
-              </w:rPr>
-              <w:t xml:space="preserve"> e </w:t>
-            </w:r>
-            <w:r>
-              <w:rPr>
-                <w:rFonts w:ascii="Courier New" w:hAnsi="Courier New"/>
-                <w:b w:val="0"/>
-                <w:i w:val="0"/>
-                <w:color w:val="333333"/>
-                <w:sz w:val="20"/>
-              </w:rPr>
-              <w:t>v240</w:t>
-            </w:r>
-            <w:r>
-              <w:rPr>
-                <w:rFonts w:ascii="Calibri" w:hAnsi="Calibri"/>
-                <w:b w:val="0"/>
-                <w:i w:val="0"/>
-                <w:sz w:val="20"/>
-              </w:rPr>
-              <w:t xml:space="preserve"> referenciadas nas atividades de GMUD</w:t>
+              <w:t>v220, v230, v240 e v241 referenciadas nas atividades de GMUD</w:t>
             </w:r>
           </w:p>
         </w:tc>

</xml_diff>

<commit_message>
docs: 3ª rodada — fecha ALTA (RF07/RF08 cross-repo, encerramento 30/06, aderência ~88%, defeitos 10) + médias (T-20 AP, desvio +38h, v240 rótulo, GCO hotfix, resp F5)
Co-Authored-By: Claude Opus 4.8 (1M context) <noreply@anthropic.com>
</commit_message>
<xml_diff>
--- a/mps-nivel-c/oficial/04_registros/AASP_Andamento-Processuais/GCO-AASPAP01-001_Registro-de-Configuracao.docx
+++ b/mps-nivel-c/oficial/04_registros/AASP_Andamento-Processuais/GCO-AASPAP01-001_Registro-de-Configuracao.docx
@@ -734,7 +734,7 @@
                 <w:i w:val="0"/>
                 <w:sz w:val="20"/>
               </w:rPr>
-              <w:t xml:space="preserve">GitFlow — </w:t>
+              <w:t>GitFlow — feature/* e bugfix/* → develop; release → main; hotfix/* sobre a baseline de release publicada (homologação/produção)</w:t>
             </w:r>
             <w:r>
               <w:rPr>
@@ -744,7 +744,6 @@
                 <w:color w:val="333333"/>
                 <w:sz w:val="20"/>
               </w:rPr>
-              <w:t>feature/*</w:t>
             </w:r>
             <w:r>
               <w:rPr>
@@ -753,7 +752,6 @@
                 <w:i w:val="0"/>
                 <w:sz w:val="20"/>
               </w:rPr>
-              <w:t xml:space="preserve"> e </w:t>
             </w:r>
             <w:r>
               <w:rPr>
@@ -763,7 +761,6 @@
                 <w:color w:val="333333"/>
                 <w:sz w:val="20"/>
               </w:rPr>
-              <w:t>bugfix/*</w:t>
             </w:r>
             <w:r>
               <w:rPr>
@@ -772,7 +769,6 @@
                 <w:i w:val="0"/>
                 <w:sz w:val="20"/>
               </w:rPr>
-              <w:t xml:space="preserve"> → </w:t>
             </w:r>
             <w:r>
               <w:rPr>
@@ -782,7 +778,6 @@
                 <w:color w:val="333333"/>
                 <w:sz w:val="20"/>
               </w:rPr>
-              <w:t>develop</w:t>
             </w:r>
             <w:r>
               <w:rPr>
@@ -791,7 +786,6 @@
                 <w:i w:val="0"/>
                 <w:sz w:val="20"/>
               </w:rPr>
-              <w:t xml:space="preserve">; </w:t>
             </w:r>
             <w:r>
               <w:rPr>
@@ -801,7 +795,6 @@
                 <w:color w:val="333333"/>
                 <w:sz w:val="20"/>
               </w:rPr>
-              <w:t>release</w:t>
             </w:r>
             <w:r>
               <w:rPr>
@@ -810,7 +803,6 @@
                 <w:i w:val="0"/>
                 <w:sz w:val="20"/>
               </w:rPr>
-              <w:t xml:space="preserve"> → </w:t>
             </w:r>
             <w:r>
               <w:rPr>
@@ -820,7 +812,6 @@
                 <w:color w:val="333333"/>
                 <w:sz w:val="20"/>
               </w:rPr>
-              <w:t>main</w:t>
             </w:r>
             <w:r>
               <w:rPr>
@@ -829,7 +820,6 @@
                 <w:i w:val="0"/>
                 <w:sz w:val="20"/>
               </w:rPr>
-              <w:t xml:space="preserve">; </w:t>
             </w:r>
             <w:r>
               <w:rPr>
@@ -839,7 +829,6 @@
                 <w:color w:val="333333"/>
                 <w:sz w:val="20"/>
               </w:rPr>
-              <w:t>hotfix/*</w:t>
             </w:r>
             <w:r>
               <w:rPr>
@@ -848,7 +837,6 @@
                 <w:i w:val="0"/>
                 <w:sz w:val="20"/>
               </w:rPr>
-              <w:t xml:space="preserve"> a partir de </w:t>
             </w:r>
             <w:r>
               <w:rPr>
@@ -858,7 +846,6 @@
                 <w:color w:val="333333"/>
                 <w:sz w:val="20"/>
               </w:rPr>
-              <w:t>main</w:t>
             </w:r>
           </w:p>
         </w:tc>

</xml_diff>

<commit_message>
docs(registros): AASPAP/GCO — gestão do projeto no GitLab (substitui o Jira)
A gestão do projeto (backlog, quadro e acompanhamento) é feita no próprio GitLab.
Substitui o link do Jira (ADPRC) e a referência "carga no Jira" do IC-06 — resíduo de
cópia do projeto irmão AASP_CNJ — pelo projeto GitLab aasp/andamentosprocessuais.

https://claude.ai/code/session_01D9YHKrGanfZsACSZKYQDTp
</commit_message>
<xml_diff>
--- a/mps-nivel-c/oficial/04_registros/AASP_Andamento-Processuais/GCO-AASPAP01-001_Registro-de-Configuracao.docx
+++ b/mps-nivel-c/oficial/04_registros/AASP_Andamento-Processuais/GCO-AASPAP01-001_Registro-de-Configuracao.docx
@@ -1708,13 +1708,7 @@
               <w:spacing w:before="40" w:after="40"/>
             </w:pPr>
             <w:r>
-              <w:rPr>
-                <w:rFonts w:ascii="Calibri" w:hAnsi="Calibri"/>
-                <w:b w:val="0"/>
-                <w:i w:val="0"/>
-                <w:sz w:val="20"/>
-              </w:rPr>
-              <w:t>Planilha de gestão (backlog, sprints, tarefas) — base para carga no Jira</w:t>
+              <w:t>Planilha de gestão (backlog, sprints, tarefas) — base para o backlog/quadro do projeto no GitLab</w:t>
             </w:r>
           </w:p>
         </w:tc>
@@ -3061,15 +3055,12 @@
     </w:p>
     <w:p>
       <w:r>
-        <w:rPr>
-          <w:b/>
-        </w:rPr>
-        <w:t>7. Acesso e evidências (GitLab · Jira)</w:t>
+        <w:t>7. Acesso e evidências (GitLab)</w:t>
       </w:r>
     </w:p>
     <w:p>
       <w:r>
-        <w:t>Os itens de configuração do projeto residem no GitLab self-hospedado da Timeware (acesso restrito à rede/credenciais corporativas); o acompanhamento do backlog é feito no Jira. Links de acesso para consulta das evidências:</w:t>
+        <w:t>Os itens de configuração do projeto residem no GitLab self-hospedado da Timeware (acesso restrito à rede/credenciais corporativas); o acompanhamento do backlog e do projeto é feito no próprio GitLab. Links de acesso para consulta das evidências:</w:t>
       </w:r>
     </w:p>
     <w:tbl>
@@ -3199,7 +3190,7 @@
           </w:tcPr>
           <w:p>
             <w:r>
-              <w:t>Backlog e acompanhamento (Jira — projeto ADPRC)</w:t>
+              <w:t>Gestão do projeto (backlog, quadro e acompanhamento)</w:t>
             </w:r>
           </w:p>
         </w:tc>
@@ -3209,7 +3200,7 @@
           </w:tcPr>
           <w:p>
             <w:r>
-              <w:t>https://timeware.atlassian.net/jira/software/c/projects/ADPRC/summary</w:t>
+              <w:t>http://191.234.192.153/aasp/andamentosprocessuais</w:t>
             </w:r>
           </w:p>
         </w:tc>

</xml_diff>